<commit_message>
Update SRA 2026_ Collaboration Contract Template.docx
</commit_message>
<xml_diff>
--- a/research_docs/SRA 2026_ Collaboration Contract Template.docx
+++ b/research_docs/SRA 2026_ Collaboration Contract Template.docx
@@ -54,7 +54,28 @@
           <w:sz w:val="24"/>
           <w:szCs w:val="24"/>
         </w:rPr>
-        <w:t xml:space="preserve">Athan Chee, Eeshan Khandelwal, Nate Sizhe </w:t>
+        <w:t xml:space="preserve">Group 1: </w:t>
+      </w:r>
+      <w:r>
+        <w:rPr>
+          <w:sz w:val="24"/>
+          <w:szCs w:val="24"/>
+        </w:rPr>
+        <w:t xml:space="preserve">Athan Chee, </w:t>
+      </w:r>
+      <w:r>
+        <w:rPr>
+          <w:sz w:val="24"/>
+          <w:szCs w:val="24"/>
+        </w:rPr>
+        <w:t xml:space="preserve">Nate Fan, </w:t>
+      </w:r>
+      <w:r>
+        <w:rPr>
+          <w:sz w:val="24"/>
+          <w:szCs w:val="24"/>
+        </w:rPr>
+        <w:t>Eeshan Khandelwal</w:t>
       </w:r>
     </w:p>
     <w:tbl>
@@ -73,8 +94,8 @@
         <w:tblLook w:val="0600"/>
       </w:tblPr>
       <w:tblGrid>
-        <w:gridCol w:w="1784"/>
-        <w:gridCol w:w="1906"/>
+        <w:gridCol w:w="1783"/>
+        <w:gridCol w:w="1907"/>
         <w:gridCol w:w="2774"/>
         <w:gridCol w:w="2535"/>
       </w:tblGrid>
@@ -84,7 +105,7 @@
         </w:trPr>
         <w:tc>
           <w:tcPr>
-            <w:tcW w:w="1784" w:type="dxa"/>
+            <w:tcW w:w="1783" w:type="dxa"/>
             <w:tcBorders>
               <w:top w:val="single" w:sz="4" w:space="0" w:color="C4C7C5"/>
               <w:left w:val="single" w:sz="4" w:space="0" w:color="C4C7C5"/>
@@ -117,7 +138,7 @@
         </w:tc>
         <w:tc>
           <w:tcPr>
-            <w:tcW w:w="1906" w:type="dxa"/>
+            <w:tcW w:w="1907" w:type="dxa"/>
             <w:tcBorders>
               <w:top w:val="single" w:sz="4" w:space="0" w:color="C4C7C5"/>
               <w:left w:val="single" w:sz="4" w:space="0" w:color="C4C7C5"/>
@@ -221,7 +242,7 @@
         </w:trPr>
         <w:tc>
           <w:tcPr>
-            <w:tcW w:w="1784" w:type="dxa"/>
+            <w:tcW w:w="1783" w:type="dxa"/>
             <w:tcBorders>
               <w:top w:val="single" w:sz="4" w:space="0" w:color="C4C7C5"/>
               <w:left w:val="single" w:sz="4" w:space="0" w:color="C4C7C5"/>
@@ -247,23 +268,13 @@
                 <w:sz w:val="24"/>
                 <w:szCs w:val="24"/>
               </w:rPr>
-              <w:t xml:space="preserve">1. </w:t>
-            </w:r>
-            <w:r>
-              <w:rPr>
-                <w:b/>
-                <w:bCs/>
-                <w:color w:val="1F1F1F"/>
-                <w:sz w:val="24"/>
-                <w:szCs w:val="24"/>
-              </w:rPr>
-              <w:t>Athan Chee</w:t>
+              <w:t>1. Athan Chee</w:t>
             </w:r>
           </w:p>
         </w:tc>
         <w:tc>
           <w:tcPr>
-            <w:tcW w:w="1906" w:type="dxa"/>
+            <w:tcW w:w="1907" w:type="dxa"/>
             <w:tcBorders>
               <w:top w:val="single" w:sz="4" w:space="0" w:color="C4C7C5"/>
               <w:left w:val="single" w:sz="4" w:space="0" w:color="C4C7C5"/>
@@ -358,7 +369,7 @@
         </w:trPr>
         <w:tc>
           <w:tcPr>
-            <w:tcW w:w="1784" w:type="dxa"/>
+            <w:tcW w:w="1783" w:type="dxa"/>
             <w:tcBorders>
               <w:top w:val="single" w:sz="4" w:space="0" w:color="C4C7C5"/>
               <w:left w:val="single" w:sz="4" w:space="0" w:color="C4C7C5"/>
@@ -384,23 +395,13 @@
                 <w:sz w:val="24"/>
                 <w:szCs w:val="24"/>
               </w:rPr>
-              <w:t xml:space="preserve">2. </w:t>
-            </w:r>
-            <w:r>
-              <w:rPr>
-                <w:b/>
-                <w:bCs/>
-                <w:color w:val="1F1F1F"/>
-                <w:sz w:val="24"/>
-                <w:szCs w:val="24"/>
-              </w:rPr>
-              <w:t>Eeshan Khandelwal</w:t>
+              <w:t>2. Eeshan Khandelwal</w:t>
             </w:r>
           </w:p>
         </w:tc>
         <w:tc>
           <w:tcPr>
-            <w:tcW w:w="1906" w:type="dxa"/>
+            <w:tcW w:w="1907" w:type="dxa"/>
             <w:tcBorders>
               <w:top w:val="single" w:sz="4" w:space="0" w:color="C4C7C5"/>
               <w:left w:val="single" w:sz="4" w:space="0" w:color="C4C7C5"/>
@@ -484,15 +485,7 @@
                 <w:sz w:val="24"/>
                 <w:szCs w:val="24"/>
               </w:rPr>
-              <w:t xml:space="preserve">I have a strong mathematical foundation in machine learning, computational mathematics, </w:t>
-            </w:r>
-            <w:r>
-              <w:rPr>
-                <w:color w:val="1F1F1F"/>
-                <w:sz w:val="24"/>
-                <w:szCs w:val="24"/>
-              </w:rPr>
-              <w:t>calculus.</w:t>
+              <w:t>I have a strong mathematical foundation in machine learning, computational mathematics, calculus.</w:t>
             </w:r>
           </w:p>
         </w:tc>
@@ -503,7 +496,7 @@
         </w:trPr>
         <w:tc>
           <w:tcPr>
-            <w:tcW w:w="1784" w:type="dxa"/>
+            <w:tcW w:w="1783" w:type="dxa"/>
             <w:tcBorders>
               <w:top w:val="single" w:sz="4" w:space="0" w:color="C4C7C5"/>
               <w:left w:val="single" w:sz="4" w:space="0" w:color="C4C7C5"/>
@@ -529,33 +522,13 @@
                 <w:sz w:val="24"/>
                 <w:szCs w:val="24"/>
               </w:rPr>
-              <w:t>3.</w:t>
-            </w:r>
-            <w:r>
-              <w:rPr>
-                <w:b/>
-                <w:bCs/>
-                <w:color w:val="1F1F1F"/>
-                <w:sz w:val="24"/>
-                <w:szCs w:val="24"/>
-              </w:rPr>
-              <w:t xml:space="preserve">Nate </w:t>
-            </w:r>
-            <w:r>
-              <w:rPr>
-                <w:b/>
-                <w:bCs/>
-                <w:color w:val="1F1F1F"/>
-                <w:sz w:val="24"/>
-                <w:szCs w:val="24"/>
-              </w:rPr>
-              <w:t>Fan</w:t>
+              <w:t>3.Nate Fan</w:t>
             </w:r>
           </w:p>
         </w:tc>
         <w:tc>
           <w:tcPr>
-            <w:tcW w:w="1906" w:type="dxa"/>
+            <w:tcW w:w="1907" w:type="dxa"/>
             <w:tcBorders>
               <w:top w:val="single" w:sz="4" w:space="0" w:color="C4C7C5"/>
               <w:left w:val="single" w:sz="4" w:space="0" w:color="C4C7C5"/>
@@ -639,7 +612,23 @@
                 <w:sz w:val="24"/>
                 <w:szCs w:val="24"/>
               </w:rPr>
-              <w:t>I am strong in applied mathematics and I am comfortable approaching others.</w:t>
+              <w:t xml:space="preserve">I am strong in applied mathematics and I am comfortable approaching others, </w:t>
+            </w:r>
+            <w:r>
+              <w:rPr>
+                <w:color w:val="1F1F1F"/>
+                <w:sz w:val="24"/>
+                <w:szCs w:val="24"/>
+              </w:rPr>
+              <w:t>managing times and organizing</w:t>
+            </w:r>
+            <w:r>
+              <w:rPr>
+                <w:color w:val="1F1F1F"/>
+                <w:sz w:val="24"/>
+                <w:szCs w:val="24"/>
+              </w:rPr>
+              <w:t>.</w:t>
             </w:r>
           </w:p>
         </w:tc>
@@ -983,14 +972,7 @@
           <w:sz w:val="24"/>
           <w:szCs w:val="24"/>
         </w:rPr>
-        <w:t xml:space="preserve"> </w:t>
-      </w:r>
-      <w:r>
-        <w:rPr>
-          <w:sz w:val="24"/>
-          <w:szCs w:val="24"/>
-        </w:rPr>
-        <w:t xml:space="preserve">will primarily act as the </w:t>
+        <w:t xml:space="preserve"> will primarily act as the </w:t>
       </w:r>
       <w:r>
         <w:rPr>
@@ -1131,14 +1113,7 @@
           <w:sz w:val="24"/>
           <w:szCs w:val="24"/>
         </w:rPr>
-        <w:t xml:space="preserve"> </w:t>
-      </w:r>
-      <w:r>
-        <w:rPr>
-          <w:sz w:val="24"/>
-          <w:szCs w:val="24"/>
-        </w:rPr>
-        <w:t>We will meet after Lecture and after Labs in the library to discuss the project. We are also meet for lunch and dinner.</w:t>
+        <w:t xml:space="preserve"> We will meet after Lecture and after Labs in the library to discuss the project. We are also meet for lunch and dinner.</w:t>
       </w:r>
     </w:p>
     <w:p>
@@ -1194,14 +1169,7 @@
           <w:sz w:val="24"/>
           <w:szCs w:val="24"/>
         </w:rPr>
-        <w:t xml:space="preserve"> </w:t>
-      </w:r>
-      <w:r>
-        <w:rPr>
-          <w:sz w:val="24"/>
-          <w:szCs w:val="24"/>
-        </w:rPr>
-        <w:t>Within 1 hour if the message is sent before 11pm. The next day if the message is sent after 11pm.</w:t>
+        <w:t xml:space="preserve"> Within 1 hour if the message is sent before 11pm. The next day if the message is sent after 11pm.</w:t>
       </w:r>
     </w:p>
     <w:p>
@@ -1257,21 +1225,7 @@
           <w:sz w:val="24"/>
           <w:szCs w:val="24"/>
         </w:rPr>
-        <w:t xml:space="preserve"> </w:t>
-      </w:r>
-      <w:r>
-        <w:rPr>
-          <w:sz w:val="24"/>
-          <w:szCs w:val="24"/>
-        </w:rPr>
-        <w:t xml:space="preserve">Our </w:t>
-      </w:r>
-      <w:r>
-        <w:rPr>
-          <w:sz w:val="24"/>
-          <w:szCs w:val="24"/>
-        </w:rPr>
-        <w:t>planning files will be on Google Drive and coding will be on GitHub.</w:t>
+        <w:t xml:space="preserve"> Our planning files will be on Google Drive and coding will be on GitHub.</w:t>
       </w:r>
     </w:p>
     <w:p>
@@ -1376,14 +1330,7 @@
           <w:sz w:val="24"/>
           <w:szCs w:val="24"/>
         </w:rPr>
-        <w:t xml:space="preserve"> </w:t>
-      </w:r>
-      <w:r>
-        <w:rPr>
-          <w:sz w:val="24"/>
-          <w:szCs w:val="24"/>
-        </w:rPr>
-        <w:t>You must come to group meetings and contribute 4 hours a day to the project. You should also contribute to the GitHub project with at least 2 commits a week.</w:t>
+        <w:t xml:space="preserve"> You must come to group meetings and contribute 4 hours a day to the project. You should also contribute to the GitHub project with at least 2 commits a week.</w:t>
       </w:r>
     </w:p>
     <w:p>
@@ -1452,28 +1399,7 @@
           <w:sz w:val="24"/>
           <w:szCs w:val="24"/>
         </w:rPr>
-        <w:t xml:space="preserve"> </w:t>
-      </w:r>
-      <w:r>
-        <w:rPr>
-          <w:sz w:val="24"/>
-          <w:szCs w:val="24"/>
-        </w:rPr>
-        <w:t xml:space="preserve">They are exempted from </w:t>
-      </w:r>
-      <w:r>
-        <w:rPr>
-          <w:sz w:val="24"/>
-          <w:szCs w:val="24"/>
-        </w:rPr>
-        <w:t xml:space="preserve">all responsibilities and </w:t>
-      </w:r>
-      <w:r>
-        <w:rPr>
-          <w:sz w:val="24"/>
-          <w:szCs w:val="24"/>
-        </w:rPr>
-        <w:t>should inform us immediately after it happens.</w:t>
+        <w:t xml:space="preserve"> They are exempted from all responsibilities and should inform us immediately after it happens.</w:t>
       </w:r>
     </w:p>
     <w:p>
@@ -1578,49 +1504,7 @@
           <w:sz w:val="24"/>
           <w:szCs w:val="24"/>
         </w:rPr>
-        <w:t xml:space="preserve"> </w:t>
-      </w:r>
-      <w:r>
-        <w:rPr>
-          <w:sz w:val="24"/>
-          <w:szCs w:val="24"/>
-        </w:rPr>
-        <w:t xml:space="preserve">Every </w:t>
-      </w:r>
-      <w:r>
-        <w:rPr>
-          <w:sz w:val="24"/>
-          <w:szCs w:val="24"/>
-        </w:rPr>
-        <w:t>p</w:t>
-      </w:r>
-      <w:r>
-        <w:rPr>
-          <w:sz w:val="24"/>
-          <w:szCs w:val="24"/>
-        </w:rPr>
-        <w:t xml:space="preserve">aper, video, AI use and other </w:t>
-      </w:r>
-      <w:r>
-        <w:rPr>
-          <w:sz w:val="24"/>
-          <w:szCs w:val="24"/>
-        </w:rPr>
-        <w:t>sources</w:t>
-      </w:r>
-      <w:r>
-        <w:rPr>
-          <w:sz w:val="24"/>
-          <w:szCs w:val="24"/>
-        </w:rPr>
-        <w:t xml:space="preserve"> must be quickly documented with a short explanation of what it was used for. This source </w:t>
-      </w:r>
-      <w:r>
-        <w:rPr>
-          <w:sz w:val="24"/>
-          <w:szCs w:val="24"/>
-        </w:rPr>
-        <w:t>must be cited further if it is important to the final paper.</w:t>
+        <w:t xml:space="preserve"> Every paper, video, AI use and other sources must be quickly documented with a short explanation of what it was used for. This source must be cited further if it is important to the final paper.</w:t>
       </w:r>
     </w:p>
     <w:p>
@@ -1858,15 +1742,7 @@
           <w:szCs w:val="24"/>
           <w:u w:val="single"/>
         </w:rPr>
-        <w:t>Athan Chee</w:t>
-      </w:r>
-      <w:r>
-        <w:rPr>
-          <w:sz w:val="24"/>
-          <w:szCs w:val="24"/>
-          <w:u w:val="single"/>
-        </w:rPr>
-        <w:t xml:space="preserve"> </w:t>
+        <w:t xml:space="preserve">Athan Chee </w:t>
       </w:r>
       <w:r>
         <w:rPr>
@@ -1917,23 +1793,7 @@
           <w:szCs w:val="24"/>
           <w:u w:val="single"/>
         </w:rPr>
-        <w:t xml:space="preserve"> </w:t>
-      </w:r>
-      <w:r>
-        <w:rPr>
-          <w:sz w:val="24"/>
-          <w:szCs w:val="24"/>
-          <w:u w:val="single"/>
-        </w:rPr>
-        <w:t>Nate Fan</w:t>
-      </w:r>
-      <w:r>
-        <w:rPr>
-          <w:sz w:val="24"/>
-          <w:szCs w:val="24"/>
-          <w:u w:val="single"/>
-        </w:rPr>
-        <w:t xml:space="preserve"> </w:t>
+        <w:t xml:space="preserve"> Nate Fan </w:t>
       </w:r>
       <w:r>
         <w:rPr>
@@ -3379,6 +3239,7 @@
     <w:qFormat/>
     <w:pPr>
       <w:widowControl/>
+      <w:suppressAutoHyphens w:val="true"/>
       <w:bidi w:val="0"/>
       <w:spacing w:lineRule="auto" w:line="276" w:before="0" w:after="0"/>
       <w:jc w:val="left"/>
@@ -3561,6 +3422,7 @@
     <w:qFormat/>
     <w:pPr>
       <w:widowControl/>
+      <w:suppressAutoHyphens w:val="true"/>
       <w:bidi w:val="0"/>
       <w:spacing w:lineRule="auto" w:line="276" w:before="0" w:after="0"/>
       <w:jc w:val="left"/>

</xml_diff>